<commit_message>
Add default 3.3 Switchgear section, section block reordering, and top page break for section headings
</commit_message>
<xml_diff>
--- a/backend/reports/templates_docx/template.docx
+++ b/backend/reports/templates_docx/template.docx
@@ -562,12 +562,12 @@
     </w:tbl>
     <w:p>
       <w:r>
-        <w:br w:type="page"/>
+        <w:t>{% for section in sections %}</w:t>
       </w:r>
     </w:p>
     <w:p>
       <w:r>
-        <w:t>{% for section in sections %}</w:t>
+        <w:br w:type="page"/>
       </w:r>
     </w:p>
     <w:tbl>

</xml_diff>

<commit_message>
Add flexible bullet note placement (above photos, below 2 photos, or below all photos) for Word and PDF reports
</commit_message>
<xml_diff>
--- a/backend/reports/templates_docx/template.docx
+++ b/backend/reports/templates_docx/template.docx
@@ -624,7 +624,17 @@
     </w:p>
     <w:p>
       <w:r>
-        <w:t>{% for note in section.notes %}</w:t>
+        <w:t>{% for block in section.blocks %}</w:t>
+      </w:r>
+    </w:p>
+    <w:p>
+      <w:r>
+        <w:t>{% if block.type == 'notes' %}</w:t>
+      </w:r>
+    </w:p>
+    <w:p>
+      <w:r>
+        <w:t>{% for note in block.notes_list %}</w:t>
       </w:r>
     </w:p>
     <w:p>
@@ -648,7 +658,12 @@
     </w:p>
     <w:p>
       <w:r>
-        <w:t>{% for row in section.image_rows %}</w:t>
+        <w:t>{% endif %}</w:t>
+      </w:r>
+    </w:p>
+    <w:p>
+      <w:r>
+        <w:t>{% if block.type == 'image_row' %}</w:t>
       </w:r>
     </w:p>
     <w:p>
@@ -662,7 +677,7 @@
           <w:b/>
           <w:sz w:val="20"/>
         </w:rPr>
-        <w:t>{% if row.sub1 %}{{ row.sub1 }}{% endif %}              {% if row.sub2 %}{{ row.sub2 }}{% endif %}</w:t>
+        <w:t>{% if block.sub1 %}{{ block.sub1 }}{% endif %}              {% if block.sub2 %}{{ block.sub2 }}{% endif %}</w:t>
       </w:r>
     </w:p>
     <w:p>
@@ -671,7 +686,7 @@
         <w:jc w:val="center"/>
       </w:pPr>
       <w:r>
-        <w:t>{% if row.img1 %}{{ row.img1 }}{% endif %}    {% if row.img2 %}{{ row.img2 }}{% endif %}</w:t>
+        <w:t>{% if block.img1 %}{{ block.img1 }}{% endif %}    {% if block.img2 %}{{ block.img2 }}{% endif %}</w:t>
       </w:r>
     </w:p>
     <w:p>
@@ -684,13 +699,15 @@
           <w:rFonts w:ascii="Calibri" w:hAnsi="Calibri"/>
           <w:sz w:val="17"/>
         </w:rPr>
-        <w:t>{% if row.cap1 %}{{ row.cap1 }}{% endif %}      {% if row.cap2 %}{{ row.cap2 }}{% endif %}</w:t>
+        <w:t>{% if block.cap1 %}{{ block.cap1 }}{% endif %}      {% if block.cap2 %}{{ block.cap2 }}{% endif %}</w:t>
       </w:r>
     </w:p>
     <w:p>
-      <w:pPr>
-        <w:spacing w:before="0" w:after="40"/>
-      </w:pPr>
+      <w:r>
+        <w:t>{% endif %}</w:t>
+      </w:r>
+    </w:p>
+    <w:p>
       <w:r>
         <w:t>{% endfor %}</w:t>
       </w:r>

</xml_diff>

<commit_message>
Update report generator layout: 6 photos per page, top-left aligned image titles, note position options, and header margin spacing fix
</commit_message>
<xml_diff>
--- a/backend/reports/templates_docx/template.docx
+++ b/backend/reports/templates_docx/template.docx
@@ -666,42 +666,122 @@
         <w:t>{% if block.type == 'image_row' %}</w:t>
       </w:r>
     </w:p>
-    <w:p>
-      <w:pPr>
-        <w:spacing w:before="40" w:after="40"/>
+    <w:tbl>
+      <w:tblPr>
+        <w:tblW w:type="auto" w:w="0"/>
         <w:jc w:val="center"/>
-      </w:pPr>
-      <w:r>
-        <w:rPr>
-          <w:rFonts w:ascii="Calibri" w:hAnsi="Calibri"/>
-          <w:b/>
-          <w:sz w:val="20"/>
-        </w:rPr>
-        <w:t>{% if block.sub1 %}{{ block.sub1 }}{% endif %}              {% if block.sub2 %}{{ block.sub2 }}{% endif %}</w:t>
-      </w:r>
-    </w:p>
-    <w:p>
-      <w:pPr>
-        <w:spacing w:before="40" w:after="40"/>
-        <w:jc w:val="center"/>
-      </w:pPr>
-      <w:r>
-        <w:t>{% if block.img1 %}{{ block.img1 }}{% endif %}    {% if block.img2 %}{{ block.img2 }}{% endif %}</w:t>
-      </w:r>
-    </w:p>
-    <w:p>
-      <w:pPr>
-        <w:spacing w:before="0" w:after="120"/>
-        <w:jc w:val="center"/>
-      </w:pPr>
-      <w:r>
-        <w:rPr>
-          <w:rFonts w:ascii="Calibri" w:hAnsi="Calibri"/>
-          <w:sz w:val="17"/>
-        </w:rPr>
-        <w:t>{% if block.cap1 %}{{ block.cap1 }}{% endif %}      {% if block.cap2 %}{{ block.cap2 }}{% endif %}</w:t>
-      </w:r>
-    </w:p>
+        <w:tblLayout w:type="fixed"/>
+        <w:tblLook w:firstColumn="1" w:firstRow="1" w:lastColumn="0" w:lastRow="0" w:noHBand="0" w:noVBand="1" w:val="04A0"/>
+        <w:tblBorders>
+          <w:top w:val="none"/>
+          <w:left w:val="none"/>
+          <w:bottom w:val="none"/>
+          <w:right w:val="none"/>
+          <w:insideH w:val="none"/>
+          <w:insideV w:val="none"/>
+        </w:tblBorders>
+      </w:tblPr>
+      <w:tblGrid>
+        <w:gridCol w:w="5234"/>
+        <w:gridCol w:w="5234"/>
+      </w:tblGrid>
+      <w:tr>
+        <w:tc>
+          <w:tcPr>
+            <w:tcW w:type="dxa" w:w="5112"/>
+            <w:tcMar>
+              <w:top w:w="20" w:type="dxa"/>
+              <w:bottom w:w="40" w:type="dxa"/>
+              <w:left w:w="20" w:type="dxa"/>
+              <w:right w:w="40" w:type="dxa"/>
+            </w:tcMar>
+          </w:tcPr>
+          <w:p>
+            <w:pPr>
+              <w:spacing w:before="40" w:after="40"/>
+              <w:jc w:val="left"/>
+            </w:pPr>
+            <w:r>
+              <w:rPr>
+                <w:rFonts w:ascii="Calibri" w:hAnsi="Calibri"/>
+                <w:b/>
+                <w:sz w:val="20"/>
+              </w:rPr>
+              <w:t>{% if block.sub1 %}{{ block.sub1 }}{% endif %}</w:t>
+            </w:r>
+          </w:p>
+          <w:p>
+            <w:pPr>
+              <w:spacing w:before="0" w:after="40"/>
+              <w:jc w:val="left"/>
+            </w:pPr>
+            <w:r>
+              <w:t>{% if block.img1 %}{{ block.img1 }}{% endif %}</w:t>
+            </w:r>
+          </w:p>
+          <w:p>
+            <w:pPr>
+              <w:spacing w:before="0" w:after="80"/>
+              <w:jc w:val="left"/>
+            </w:pPr>
+            <w:r>
+              <w:rPr>
+                <w:rFonts w:ascii="Calibri" w:hAnsi="Calibri"/>
+                <w:sz w:val="17"/>
+              </w:rPr>
+              <w:t>{% if block.cap1 %}{{ block.cap1 }}{% endif %}</w:t>
+            </w:r>
+          </w:p>
+        </w:tc>
+        <w:tc>
+          <w:tcPr>
+            <w:tcW w:type="dxa" w:w="5112"/>
+            <w:tcMar>
+              <w:top w:w="20" w:type="dxa"/>
+              <w:bottom w:w="40" w:type="dxa"/>
+              <w:left w:w="40" w:type="dxa"/>
+              <w:right w:w="20" w:type="dxa"/>
+            </w:tcMar>
+          </w:tcPr>
+          <w:p>
+            <w:pPr>
+              <w:spacing w:before="40" w:after="40"/>
+              <w:jc w:val="left"/>
+            </w:pPr>
+            <w:r>
+              <w:rPr>
+                <w:rFonts w:ascii="Calibri" w:hAnsi="Calibri"/>
+                <w:b/>
+                <w:sz w:val="20"/>
+              </w:rPr>
+              <w:t>{% if block.sub2 %}{{ block.sub2 }}{% endif %}</w:t>
+            </w:r>
+          </w:p>
+          <w:p>
+            <w:pPr>
+              <w:spacing w:before="0" w:after="40"/>
+              <w:jc w:val="left"/>
+            </w:pPr>
+            <w:r>
+              <w:t>{% if block.img2 %}{{ block.img2 }}{% endif %}</w:t>
+            </w:r>
+          </w:p>
+          <w:p>
+            <w:pPr>
+              <w:spacing w:before="0" w:after="80"/>
+              <w:jc w:val="left"/>
+            </w:pPr>
+            <w:r>
+              <w:rPr>
+                <w:rFonts w:ascii="Calibri" w:hAnsi="Calibri"/>
+                <w:sz w:val="17"/>
+              </w:rPr>
+              <w:t>{% if block.cap2 %}{{ block.cap2 }}{% endif %}</w:t>
+            </w:r>
+          </w:p>
+        </w:tc>
+      </w:tr>
+    </w:tbl>
     <w:p>
       <w:r>
         <w:t>{% endif %}</w:t>
@@ -736,7 +816,7 @@
       <w:headerReference w:type="default" r:id="rId9"/>
       <w:footerReference w:type="default" r:id="rId10"/>
       <w:pgSz w:w="11909" w:h="16834"/>
-      <w:pgMar w:top="576" w:right="720" w:bottom="576" w:left="720" w:header="403" w:footer="360" w:gutter="0"/>
+      <w:pgMar w:top="1368" w:right="720" w:bottom="576" w:left="720" w:header="403" w:footer="360" w:gutter="0"/>
       <w:cols w:space="720"/>
       <w:docGrid w:linePitch="360"/>
       <w:pgBorders w:offsetFrom="text">

</xml_diff>

<commit_message>
feat: add multi-page per section support, auto-fit photo layouts, and live A4 preview
</commit_message>
<xml_diff>
--- a/backend/reports/templates_docx/template.docx
+++ b/backend/reports/templates_docx/template.docx
@@ -562,12 +562,23 @@
     </w:tbl>
     <w:p>
       <w:r>
-        <w:t>{% for section in sections %}</w:t>
+        <w:t>{% for page in pages %}</w:t>
       </w:r>
     </w:p>
     <w:p>
       <w:r>
+        <w:t>{% if not loop.first %}</w:t>
+      </w:r>
+      <w:r>
         <w:br w:type="page"/>
+      </w:r>
+      <w:r>
+        <w:t>{% endif %}</w:t>
+      </w:r>
+    </w:p>
+    <w:p>
+      <w:r>
+        <w:t>{% if page.is_first_page_of_section and page.section_title %}</w:t>
       </w:r>
     </w:p>
     <w:tbl>
@@ -611,7 +622,7 @@
                 <w:color w:val="000000"/>
                 <w:sz w:val="24"/>
               </w:rPr>
-              <w:t>{{ section.title }}</w:t>
+              <w:t>{{ page.section_title }}</w:t>
             </w:r>
           </w:p>
         </w:tc>
@@ -624,23 +635,103 @@
     </w:p>
     <w:p>
       <w:r>
-        <w:t>{% for block in section.blocks %}</w:t>
+        <w:t>{% endif %}</w:t>
       </w:r>
     </w:p>
     <w:p>
       <w:r>
-        <w:t>{% if block.type == 'notes' %}</w:t>
+        <w:t>{% if page.subtitle %}</w:t>
+      </w:r>
+    </w:p>
+    <w:tbl>
+      <w:tblPr>
+        <w:tblW w:type="auto" w:w="0"/>
+        <w:jc w:val="left"/>
+        <w:tblLook w:firstColumn="1" w:firstRow="1" w:lastColumn="0" w:lastRow="0" w:noHBand="0" w:noVBand="1" w:val="04A0"/>
+        <w:tblBorders>
+          <w:top w:val="none"/>
+          <w:left w:val="none"/>
+          <w:bottom w:val="none"/>
+          <w:right w:val="none"/>
+          <w:insideH w:val="none"/>
+          <w:insideV w:val="none"/>
+        </w:tblBorders>
+      </w:tblPr>
+      <w:tblGrid>
+        <w:gridCol w:w="5234"/>
+        <w:gridCol w:w="5234"/>
+      </w:tblGrid>
+      <w:tr>
+        <w:tc>
+          <w:tcPr>
+            <w:tcW w:type="dxa" w:w="504"/>
+            <w:tcMar>
+              <w:top w:w="0" w:type="dxa"/>
+              <w:bottom w:w="0" w:type="dxa"/>
+              <w:left w:w="0" w:type="dxa"/>
+              <w:right w:w="0" w:type="dxa"/>
+            </w:tcMar>
+          </w:tcPr>
+          <w:p/>
+        </w:tc>
+        <w:tc>
+          <w:tcPr>
+            <w:tcW w:type="dxa" w:w="7560"/>
+            <w:shd w:fill="B4C6E7"/>
+            <w:tcMar>
+              <w:top w:w="50" w:type="dxa"/>
+              <w:bottom w:w="50" w:type="dxa"/>
+              <w:left w:w="120" w:type="dxa"/>
+              <w:right w:w="120" w:type="dxa"/>
+            </w:tcMar>
+          </w:tcPr>
+          <w:p>
+            <w:pPr>
+              <w:spacing w:before="0" w:after="0"/>
+              <w:jc w:val="left"/>
+            </w:pPr>
+            <w:r>
+              <w:rPr>
+                <w:rFonts w:ascii="Calibri" w:hAnsi="Calibri"/>
+                <w:b/>
+                <w:color w:val="000000"/>
+                <w:sz w:val="22"/>
+              </w:rPr>
+              <w:t>{{ page.subtitle }}</w:t>
+            </w:r>
+          </w:p>
+        </w:tc>
+      </w:tr>
+    </w:tbl>
+    <w:p>
+      <w:pPr>
+        <w:spacing w:before="40" w:after="80"/>
+      </w:pPr>
+    </w:p>
+    <w:p>
+      <w:r>
+        <w:t>{% endif %}</w:t>
+      </w:r>
+    </w:p>
+    <w:p>
+      <w:pPr>
+        <w:spacing w:before="80" w:after="160"/>
+      </w:pPr>
+    </w:p>
+    <w:p>
+      <w:r>
+        <w:t>{% if page.notes %}</w:t>
       </w:r>
     </w:p>
     <w:p>
       <w:r>
-        <w:t>{% for note in block.notes_list %}</w:t>
+        <w:t>{% for note in page.notes %}</w:t>
       </w:r>
     </w:p>
     <w:p>
       <w:pPr>
         <w:spacing w:before="40" w:after="80"/>
-        <w:ind w:left="432"/>
+        <w:ind w:left="288"/>
       </w:pPr>
       <w:r>
         <w:rPr>
@@ -663,7 +754,171 @@
     </w:p>
     <w:p>
       <w:r>
-        <w:t>{% if block.type == 'image_row' %}</w:t>
+        <w:t>{% if page.layout == '1_full' %}</w:t>
+      </w:r>
+    </w:p>
+    <w:p>
+      <w:pPr>
+        <w:spacing w:before="0" w:after="40"/>
+        <w:jc w:val="center"/>
+      </w:pPr>
+      <w:r>
+        <w:rPr>
+          <w:rFonts w:ascii="Calibri" w:hAnsi="Calibri"/>
+          <w:b/>
+          <w:sz w:val="20"/>
+        </w:rPr>
+        <w:t>{% if page.sub1 %}{{ page.sub1 }}{% endif %}</w:t>
+      </w:r>
+    </w:p>
+    <w:p>
+      <w:pPr>
+        <w:spacing w:before="0" w:after="40"/>
+        <w:jc w:val="center"/>
+      </w:pPr>
+      <w:r>
+        <w:t>{% if page.img1 %}{{ page.img1 }}{% endif %}</w:t>
+      </w:r>
+    </w:p>
+    <w:p>
+      <w:pPr>
+        <w:spacing w:before="0" w:after="80"/>
+        <w:jc w:val="center"/>
+      </w:pPr>
+      <w:r>
+        <w:rPr>
+          <w:rFonts w:ascii="Calibri" w:hAnsi="Calibri"/>
+          <w:sz w:val="17"/>
+        </w:rPr>
+        <w:t>{% if page.cap1 %}{{ page.cap1 }}{% endif %}</w:t>
+      </w:r>
+    </w:p>
+    <w:p>
+      <w:r>
+        <w:t>{% endif %}</w:t>
+      </w:r>
+    </w:p>
+    <w:p>
+      <w:r>
+        <w:t>{% if page.layout == '2_stack' %}</w:t>
+      </w:r>
+    </w:p>
+    <w:p>
+      <w:pPr>
+        <w:spacing w:before="0" w:after="40"/>
+        <w:jc w:val="center"/>
+      </w:pPr>
+      <w:r>
+        <w:rPr>
+          <w:rFonts w:ascii="Calibri" w:hAnsi="Calibri"/>
+          <w:b/>
+          <w:sz w:val="20"/>
+        </w:rPr>
+        <w:t>{% if page.sub1 %}{{ page.sub1 }}{% endif %}</w:t>
+      </w:r>
+    </w:p>
+    <w:p>
+      <w:pPr>
+        <w:spacing w:before="0" w:after="40"/>
+        <w:jc w:val="center"/>
+      </w:pPr>
+      <w:r>
+        <w:t>{% if page.img1 %}{{ page.img1 }}{% endif %}</w:t>
+      </w:r>
+    </w:p>
+    <w:p>
+      <w:pPr>
+        <w:spacing w:before="0" w:after="120"/>
+        <w:jc w:val="center"/>
+      </w:pPr>
+      <w:r>
+        <w:rPr>
+          <w:rFonts w:ascii="Calibri" w:hAnsi="Calibri"/>
+          <w:sz w:val="17"/>
+        </w:rPr>
+        <w:t>{% if page.cap1 %}{{ page.cap1 }}{% endif %}</w:t>
+      </w:r>
+    </w:p>
+    <w:p>
+      <w:pPr>
+        <w:spacing w:before="0" w:after="40"/>
+        <w:jc w:val="center"/>
+      </w:pPr>
+      <w:r>
+        <w:rPr>
+          <w:rFonts w:ascii="Calibri" w:hAnsi="Calibri"/>
+          <w:b/>
+          <w:sz w:val="20"/>
+        </w:rPr>
+        <w:t>{% if page.sub2 %}{{ page.sub2 }}{% endif %}</w:t>
+      </w:r>
+    </w:p>
+    <w:p>
+      <w:pPr>
+        <w:spacing w:before="0" w:after="40"/>
+        <w:jc w:val="center"/>
+      </w:pPr>
+      <w:r>
+        <w:t>{% if page.img2 %}{{ page.img2 }}{% endif %}</w:t>
+      </w:r>
+    </w:p>
+    <w:p>
+      <w:pPr>
+        <w:spacing w:before="0" w:after="80"/>
+        <w:jc w:val="center"/>
+      </w:pPr>
+      <w:r>
+        <w:rPr>
+          <w:rFonts w:ascii="Calibri" w:hAnsi="Calibri"/>
+          <w:sz w:val="17"/>
+        </w:rPr>
+        <w:t>{% if page.cap2 %}{{ page.cap2 }}{% endif %}</w:t>
+      </w:r>
+    </w:p>
+    <w:p>
+      <w:r>
+        <w:t>{% endif %}</w:t>
+      </w:r>
+    </w:p>
+    <w:p>
+      <w:r>
+        <w:t>{% if page.layout == '3_hybrid' %}</w:t>
+      </w:r>
+    </w:p>
+    <w:p>
+      <w:pPr>
+        <w:spacing w:before="0" w:after="40"/>
+        <w:jc w:val="center"/>
+      </w:pPr>
+      <w:r>
+        <w:rPr>
+          <w:rFonts w:ascii="Calibri" w:hAnsi="Calibri"/>
+          <w:b/>
+          <w:sz w:val="20"/>
+        </w:rPr>
+        <w:t>{% if page.sub1 %}{{ page.sub1 }}{% endif %}</w:t>
+      </w:r>
+    </w:p>
+    <w:p>
+      <w:pPr>
+        <w:spacing w:before="0" w:after="40"/>
+        <w:jc w:val="center"/>
+      </w:pPr>
+      <w:r>
+        <w:t>{% if page.img1 %}{{ page.img1 }}{% endif %}</w:t>
+      </w:r>
+    </w:p>
+    <w:p>
+      <w:pPr>
+        <w:spacing w:before="0" w:after="120"/>
+        <w:jc w:val="center"/>
+      </w:pPr>
+      <w:r>
+        <w:rPr>
+          <w:rFonts w:ascii="Calibri" w:hAnsi="Calibri"/>
+          <w:sz w:val="17"/>
+        </w:rPr>
+        <w:t>{% if page.cap1 %}{{ page.cap1 }}{% endif %}</w:t>
       </w:r>
     </w:p>
     <w:tbl>
@@ -690,46 +945,46 @@
           <w:tcPr>
             <w:tcW w:type="dxa" w:w="5112"/>
             <w:tcMar>
-              <w:top w:w="20" w:type="dxa"/>
-              <w:bottom w:w="40" w:type="dxa"/>
-              <w:left w:w="20" w:type="dxa"/>
-              <w:right w:w="40" w:type="dxa"/>
+              <w:top w:w="10" w:type="dxa"/>
+              <w:bottom w:w="20" w:type="dxa"/>
+              <w:left w:w="10" w:type="dxa"/>
+              <w:right w:w="20" w:type="dxa"/>
             </w:tcMar>
           </w:tcPr>
           <w:p>
             <w:pPr>
-              <w:spacing w:before="40" w:after="40"/>
-              <w:jc w:val="left"/>
+              <w:spacing w:before="0" w:after="40"/>
+              <w:jc w:val="center"/>
             </w:pPr>
             <w:r>
               <w:rPr>
                 <w:rFonts w:ascii="Calibri" w:hAnsi="Calibri"/>
                 <w:b/>
-                <w:sz w:val="20"/>
+                <w:sz w:val="19"/>
               </w:rPr>
-              <w:t>{% if block.sub1 %}{{ block.sub1 }}{% endif %}</w:t>
+              <w:t>{% if page.sub2 %}{{ page.sub2 }}{% endif %}</w:t>
             </w:r>
           </w:p>
           <w:p>
             <w:pPr>
               <w:spacing w:before="0" w:after="40"/>
-              <w:jc w:val="left"/>
+              <w:jc w:val="center"/>
             </w:pPr>
             <w:r>
-              <w:t>{% if block.img1 %}{{ block.img1 }}{% endif %}</w:t>
+              <w:t>{% if page.img2 %}{{ page.img2 }}{% endif %}</w:t>
             </w:r>
           </w:p>
           <w:p>
             <w:pPr>
-              <w:spacing w:before="0" w:after="80"/>
-              <w:jc w:val="left"/>
+              <w:spacing w:before="0" w:after="40"/>
+              <w:jc w:val="center"/>
             </w:pPr>
             <w:r>
               <w:rPr>
                 <w:rFonts w:ascii="Calibri" w:hAnsi="Calibri"/>
-                <w:sz w:val="17"/>
+                <w:sz w:val="16"/>
               </w:rPr>
-              <w:t>{% if block.cap1 %}{{ block.cap1 }}{% endif %}</w:t>
+              <w:t>{% if page.cap2 %}{{ page.cap2 }}{% endif %}</w:t>
             </w:r>
           </w:p>
         </w:tc>
@@ -737,46 +992,46 @@
           <w:tcPr>
             <w:tcW w:type="dxa" w:w="5112"/>
             <w:tcMar>
-              <w:top w:w="20" w:type="dxa"/>
-              <w:bottom w:w="40" w:type="dxa"/>
-              <w:left w:w="40" w:type="dxa"/>
-              <w:right w:w="20" w:type="dxa"/>
+              <w:top w:w="10" w:type="dxa"/>
+              <w:bottom w:w="20" w:type="dxa"/>
+              <w:left w:w="20" w:type="dxa"/>
+              <w:right w:w="10" w:type="dxa"/>
             </w:tcMar>
           </w:tcPr>
           <w:p>
             <w:pPr>
-              <w:spacing w:before="40" w:after="40"/>
-              <w:jc w:val="left"/>
+              <w:spacing w:before="0" w:after="40"/>
+              <w:jc w:val="center"/>
             </w:pPr>
             <w:r>
               <w:rPr>
                 <w:rFonts w:ascii="Calibri" w:hAnsi="Calibri"/>
                 <w:b/>
-                <w:sz w:val="20"/>
+                <w:sz w:val="19"/>
               </w:rPr>
-              <w:t>{% if block.sub2 %}{{ block.sub2 }}{% endif %}</w:t>
+              <w:t>{% if page.sub3 %}{{ page.sub3 }}{% endif %}</w:t>
             </w:r>
           </w:p>
           <w:p>
             <w:pPr>
               <w:spacing w:before="0" w:after="40"/>
-              <w:jc w:val="left"/>
+              <w:jc w:val="center"/>
             </w:pPr>
             <w:r>
-              <w:t>{% if block.img2 %}{{ block.img2 }}{% endif %}</w:t>
+              <w:t>{% if page.img3 %}{{ page.img3 }}{% endif %}</w:t>
             </w:r>
           </w:p>
           <w:p>
             <w:pPr>
-              <w:spacing w:before="0" w:after="80"/>
-              <w:jc w:val="left"/>
+              <w:spacing w:before="0" w:after="40"/>
+              <w:jc w:val="center"/>
             </w:pPr>
             <w:r>
               <w:rPr>
                 <w:rFonts w:ascii="Calibri" w:hAnsi="Calibri"/>
-                <w:sz w:val="17"/>
+                <w:sz w:val="16"/>
               </w:rPr>
-              <w:t>{% if block.cap2 %}{{ block.cap2 }}{% endif %}</w:t>
+              <w:t>{% if page.cap3 %}{{ page.cap3 }}{% endif %}</w:t>
             </w:r>
           </w:p>
         </w:tc>
@@ -789,7 +1044,638 @@
     </w:p>
     <w:p>
       <w:r>
+        <w:t>{% if page.layout == '4_grid' %}</w:t>
+      </w:r>
+    </w:p>
+    <w:tbl>
+      <w:tblPr>
+        <w:tblW w:type="auto" w:w="0"/>
+        <w:jc w:val="center"/>
+        <w:tblLayout w:type="fixed"/>
+        <w:tblLook w:firstColumn="1" w:firstRow="1" w:lastColumn="0" w:lastRow="0" w:noHBand="0" w:noVBand="1" w:val="04A0"/>
+        <w:tblBorders>
+          <w:top w:val="none"/>
+          <w:left w:val="none"/>
+          <w:bottom w:val="none"/>
+          <w:right w:val="none"/>
+          <w:insideH w:val="none"/>
+          <w:insideV w:val="none"/>
+        </w:tblBorders>
+      </w:tblPr>
+      <w:tblGrid>
+        <w:gridCol w:w="5234"/>
+        <w:gridCol w:w="5234"/>
+      </w:tblGrid>
+      <w:tr>
+        <w:tc>
+          <w:tcPr>
+            <w:tcW w:type="dxa" w:w="5112"/>
+            <w:tcMar>
+              <w:top w:w="10" w:type="dxa"/>
+              <w:bottom w:w="15" w:type="dxa"/>
+              <w:left w:w="15" w:type="dxa"/>
+              <w:right w:w="15" w:type="dxa"/>
+            </w:tcMar>
+          </w:tcPr>
+          <w:p>
+            <w:pPr>
+              <w:jc w:val="center"/>
+            </w:pPr>
+            <w:r>
+              <w:rPr>
+                <w:b/>
+                <w:sz w:val="18"/>
+              </w:rPr>
+              <w:t>{% if page.sub1 %}{{ page.sub1 }}{% endif %}</w:t>
+            </w:r>
+          </w:p>
+          <w:p>
+            <w:pPr>
+              <w:jc w:val="center"/>
+            </w:pPr>
+            <w:r>
+              <w:t>{% if page.img1 %}{{ page.img1 }}{% endif %}</w:t>
+            </w:r>
+          </w:p>
+          <w:p>
+            <w:pPr>
+              <w:jc w:val="center"/>
+            </w:pPr>
+            <w:r>
+              <w:rPr>
+                <w:sz w:val="16"/>
+              </w:rPr>
+              <w:t>{% if page.cap1 %}{{ page.cap1 }}{% endif %}</w:t>
+            </w:r>
+          </w:p>
+        </w:tc>
+        <w:tc>
+          <w:tcPr>
+            <w:tcW w:type="dxa" w:w="5112"/>
+            <w:tcMar>
+              <w:top w:w="10" w:type="dxa"/>
+              <w:bottom w:w="15" w:type="dxa"/>
+              <w:left w:w="15" w:type="dxa"/>
+              <w:right w:w="15" w:type="dxa"/>
+            </w:tcMar>
+          </w:tcPr>
+          <w:p>
+            <w:pPr>
+              <w:jc w:val="center"/>
+            </w:pPr>
+            <w:r>
+              <w:rPr>
+                <w:b/>
+                <w:sz w:val="18"/>
+              </w:rPr>
+              <w:t>{% if page.sub2 %}{{ page.sub2 }}{% endif %}</w:t>
+            </w:r>
+          </w:p>
+          <w:p>
+            <w:pPr>
+              <w:jc w:val="center"/>
+            </w:pPr>
+            <w:r>
+              <w:t>{% if page.img2 %}{{ page.img2 }}{% endif %}</w:t>
+            </w:r>
+          </w:p>
+          <w:p>
+            <w:pPr>
+              <w:jc w:val="center"/>
+            </w:pPr>
+            <w:r>
+              <w:rPr>
+                <w:sz w:val="16"/>
+              </w:rPr>
+              <w:t>{% if page.cap2 %}{{ page.cap2 }}{% endif %}</w:t>
+            </w:r>
+          </w:p>
+        </w:tc>
+      </w:tr>
+      <w:tr>
+        <w:tc>
+          <w:tcPr>
+            <w:tcW w:type="dxa" w:w="5112"/>
+            <w:tcMar>
+              <w:top w:w="10" w:type="dxa"/>
+              <w:bottom w:w="15" w:type="dxa"/>
+              <w:left w:w="15" w:type="dxa"/>
+              <w:right w:w="15" w:type="dxa"/>
+            </w:tcMar>
+          </w:tcPr>
+          <w:p>
+            <w:pPr>
+              <w:jc w:val="center"/>
+            </w:pPr>
+            <w:r>
+              <w:rPr>
+                <w:b/>
+                <w:sz w:val="18"/>
+              </w:rPr>
+              <w:t>{% if page.sub3 %}{{ page.sub3 }}{% endif %}</w:t>
+            </w:r>
+          </w:p>
+          <w:p>
+            <w:pPr>
+              <w:jc w:val="center"/>
+            </w:pPr>
+            <w:r>
+              <w:t>{% if page.img3 %}{{ page.img3 }}{% endif %}</w:t>
+            </w:r>
+          </w:p>
+          <w:p>
+            <w:pPr>
+              <w:jc w:val="center"/>
+            </w:pPr>
+            <w:r>
+              <w:rPr>
+                <w:sz w:val="16"/>
+              </w:rPr>
+              <w:t>{% if page.cap3 %}{{ page.cap3 }}{% endif %}</w:t>
+            </w:r>
+          </w:p>
+        </w:tc>
+        <w:tc>
+          <w:tcPr>
+            <w:tcW w:type="dxa" w:w="5112"/>
+            <w:tcMar>
+              <w:top w:w="10" w:type="dxa"/>
+              <w:bottom w:w="15" w:type="dxa"/>
+              <w:left w:w="15" w:type="dxa"/>
+              <w:right w:w="15" w:type="dxa"/>
+            </w:tcMar>
+          </w:tcPr>
+          <w:p>
+            <w:pPr>
+              <w:jc w:val="center"/>
+            </w:pPr>
+            <w:r>
+              <w:rPr>
+                <w:b/>
+                <w:sz w:val="18"/>
+              </w:rPr>
+              <w:t>{% if page.sub4 %}{{ page.sub4 }}{% endif %}</w:t>
+            </w:r>
+          </w:p>
+          <w:p>
+            <w:pPr>
+              <w:jc w:val="center"/>
+            </w:pPr>
+            <w:r>
+              <w:t>{% if page.img4 %}{{ page.img4 }}{% endif %}</w:t>
+            </w:r>
+          </w:p>
+          <w:p>
+            <w:pPr>
+              <w:jc w:val="center"/>
+            </w:pPr>
+            <w:r>
+              <w:rPr>
+                <w:sz w:val="16"/>
+              </w:rPr>
+              <w:t>{% if page.cap4 %}{{ page.cap4 }}{% endif %}</w:t>
+            </w:r>
+          </w:p>
+        </w:tc>
+      </w:tr>
+    </w:tbl>
+    <w:p>
+      <w:r>
+        <w:t>{% endif %}</w:t>
+      </w:r>
+    </w:p>
+    <w:p>
+      <w:r>
+        <w:t>{% if page.layout == '5_grid' %}</w:t>
+      </w:r>
+    </w:p>
+    <w:tbl>
+      <w:tblPr>
+        <w:tblW w:type="auto" w:w="0"/>
+        <w:jc w:val="center"/>
+        <w:tblLayout w:type="fixed"/>
+        <w:tblLook w:firstColumn="1" w:firstRow="1" w:lastColumn="0" w:lastRow="0" w:noHBand="0" w:noVBand="1" w:val="04A0"/>
+        <w:tblBorders>
+          <w:top w:val="none"/>
+          <w:left w:val="none"/>
+          <w:bottom w:val="none"/>
+          <w:right w:val="none"/>
+          <w:insideH w:val="none"/>
+          <w:insideV w:val="none"/>
+        </w:tblBorders>
+      </w:tblPr>
+      <w:tblGrid>
+        <w:gridCol w:w="5234"/>
+        <w:gridCol w:w="5234"/>
+      </w:tblGrid>
+      <w:tr>
+        <w:tc>
+          <w:tcPr>
+            <w:tcW w:type="dxa" w:w="5112"/>
+            <w:tcMar>
+              <w:top w:w="10" w:type="dxa"/>
+              <w:bottom w:w="15" w:type="dxa"/>
+              <w:left w:w="15" w:type="dxa"/>
+              <w:right w:w="15" w:type="dxa"/>
+            </w:tcMar>
+          </w:tcPr>
+          <w:p>
+            <w:pPr>
+              <w:jc w:val="center"/>
+            </w:pPr>
+            <w:r>
+              <w:rPr>
+                <w:sz w:val="18"/>
+              </w:rPr>
+              <w:t>{% if page.sub1 %}{{ page.sub1 }}{% endif %}</w:t>
+            </w:r>
+          </w:p>
+          <w:p>
+            <w:pPr>
+              <w:jc w:val="center"/>
+            </w:pPr>
+            <w:r>
+              <w:t>{% if page.img1 %}{{ page.img1 }}{% endif %}</w:t>
+            </w:r>
+          </w:p>
+        </w:tc>
+        <w:tc>
+          <w:tcPr>
+            <w:tcW w:type="dxa" w:w="5112"/>
+            <w:tcMar>
+              <w:top w:w="10" w:type="dxa"/>
+              <w:bottom w:w="15" w:type="dxa"/>
+              <w:left w:w="15" w:type="dxa"/>
+              <w:right w:w="15" w:type="dxa"/>
+            </w:tcMar>
+          </w:tcPr>
+          <w:p>
+            <w:pPr>
+              <w:jc w:val="center"/>
+            </w:pPr>
+            <w:r>
+              <w:rPr>
+                <w:sz w:val="18"/>
+              </w:rPr>
+              <w:t>{% if page.sub2 %}{{ page.sub2 }}{% endif %}</w:t>
+            </w:r>
+          </w:p>
+          <w:p>
+            <w:pPr>
+              <w:jc w:val="center"/>
+            </w:pPr>
+            <w:r>
+              <w:t>{% if page.img2 %}{{ page.img2 }}{% endif %}</w:t>
+            </w:r>
+          </w:p>
+        </w:tc>
+      </w:tr>
+    </w:tbl>
+    <w:tbl>
+      <w:tblPr>
+        <w:tblW w:type="auto" w:w="0"/>
+        <w:jc w:val="center"/>
+        <w:tblLayout w:type="fixed"/>
+        <w:tblLook w:firstColumn="1" w:firstRow="1" w:lastColumn="0" w:lastRow="0" w:noHBand="0" w:noVBand="1" w:val="04A0"/>
+        <w:tblBorders>
+          <w:top w:val="none"/>
+          <w:left w:val="none"/>
+          <w:bottom w:val="none"/>
+          <w:right w:val="none"/>
+          <w:insideH w:val="none"/>
+          <w:insideV w:val="none"/>
+        </w:tblBorders>
+      </w:tblPr>
+      <w:tblGrid>
+        <w:gridCol w:w="3490"/>
+        <w:gridCol w:w="3490"/>
+        <w:gridCol w:w="3490"/>
+      </w:tblGrid>
+      <w:tr>
+        <w:tc>
+          <w:tcPr>
+            <w:tcW w:type="dxa" w:w="3398"/>
+            <w:tcMar>
+              <w:top w:w="10" w:type="dxa"/>
+              <w:bottom w:w="15" w:type="dxa"/>
+              <w:left w:w="10" w:type="dxa"/>
+              <w:right w:w="10" w:type="dxa"/>
+            </w:tcMar>
+          </w:tcPr>
+          <w:p>
+            <w:pPr>
+              <w:jc w:val="center"/>
+            </w:pPr>
+            <w:r>
+              <w:rPr>
+                <w:sz w:val="17"/>
+              </w:rPr>
+              <w:t>{% if page.sub3 %}{{ page.sub3 }}{% endif %}</w:t>
+            </w:r>
+          </w:p>
+          <w:p>
+            <w:pPr>
+              <w:jc w:val="center"/>
+            </w:pPr>
+            <w:r>
+              <w:t>{% if page.img3 %}{{ page.img3 }}{% endif %}</w:t>
+            </w:r>
+          </w:p>
+        </w:tc>
+        <w:tc>
+          <w:tcPr>
+            <w:tcW w:type="dxa" w:w="3398"/>
+            <w:tcMar>
+              <w:top w:w="10" w:type="dxa"/>
+              <w:bottom w:w="15" w:type="dxa"/>
+              <w:left w:w="10" w:type="dxa"/>
+              <w:right w:w="10" w:type="dxa"/>
+            </w:tcMar>
+          </w:tcPr>
+          <w:p>
+            <w:pPr>
+              <w:jc w:val="center"/>
+            </w:pPr>
+            <w:r>
+              <w:rPr>
+                <w:sz w:val="17"/>
+              </w:rPr>
+              <w:t>{% if page.sub4 %}{{ page.sub4 }}{% endif %}</w:t>
+            </w:r>
+          </w:p>
+          <w:p>
+            <w:pPr>
+              <w:jc w:val="center"/>
+            </w:pPr>
+            <w:r>
+              <w:t>{% if page.img4 %}{{ page.img4 }}{% endif %}</w:t>
+            </w:r>
+          </w:p>
+        </w:tc>
+        <w:tc>
+          <w:tcPr>
+            <w:tcW w:type="dxa" w:w="3398"/>
+            <w:tcMar>
+              <w:top w:w="10" w:type="dxa"/>
+              <w:bottom w:w="15" w:type="dxa"/>
+              <w:left w:w="10" w:type="dxa"/>
+              <w:right w:w="10" w:type="dxa"/>
+            </w:tcMar>
+          </w:tcPr>
+          <w:p>
+            <w:pPr>
+              <w:jc w:val="center"/>
+            </w:pPr>
+            <w:r>
+              <w:rPr>
+                <w:sz w:val="17"/>
+              </w:rPr>
+              <w:t>{% if page.sub5 %}{{ page.sub5 }}{% endif %}</w:t>
+            </w:r>
+          </w:p>
+          <w:p>
+            <w:pPr>
+              <w:jc w:val="center"/>
+            </w:pPr>
+            <w:r>
+              <w:t>{% if page.img5 %}{{ page.img5 }}{% endif %}</w:t>
+            </w:r>
+          </w:p>
+        </w:tc>
+      </w:tr>
+    </w:tbl>
+    <w:p>
+      <w:r>
+        <w:t>{% endif %}</w:t>
+      </w:r>
+    </w:p>
+    <w:p>
+      <w:r>
+        <w:t>{% if page.layout == '6_grid' %}</w:t>
+      </w:r>
+    </w:p>
+    <w:tbl>
+      <w:tblPr>
+        <w:tblW w:type="auto" w:w="0"/>
+        <w:jc w:val="center"/>
+        <w:tblLayout w:type="fixed"/>
+        <w:tblLook w:firstColumn="1" w:firstRow="1" w:lastColumn="0" w:lastRow="0" w:noHBand="0" w:noVBand="1" w:val="04A0"/>
+        <w:tblBorders>
+          <w:top w:val="none"/>
+          <w:left w:val="none"/>
+          <w:bottom w:val="none"/>
+          <w:right w:val="none"/>
+          <w:insideH w:val="none"/>
+          <w:insideV w:val="none"/>
+        </w:tblBorders>
+      </w:tblPr>
+      <w:tblGrid>
+        <w:gridCol w:w="3490"/>
+        <w:gridCol w:w="3490"/>
+        <w:gridCol w:w="3490"/>
+      </w:tblGrid>
+      <w:tr>
+        <w:tc>
+          <w:tcPr>
+            <w:tcW w:type="dxa" w:w="3398"/>
+            <w:tcMar>
+              <w:top w:w="10" w:type="dxa"/>
+              <w:bottom w:w="15" w:type="dxa"/>
+              <w:left w:w="10" w:type="dxa"/>
+              <w:right w:w="10" w:type="dxa"/>
+            </w:tcMar>
+          </w:tcPr>
+          <w:p>
+            <w:pPr>
+              <w:jc w:val="center"/>
+            </w:pPr>
+            <w:r>
+              <w:t>{% if page.img1 %}{{ page.img1 }}{% endif %}</w:t>
+            </w:r>
+          </w:p>
+        </w:tc>
+        <w:tc>
+          <w:tcPr>
+            <w:tcW w:type="dxa" w:w="3398"/>
+            <w:tcMar>
+              <w:top w:w="10" w:type="dxa"/>
+              <w:bottom w:w="15" w:type="dxa"/>
+              <w:left w:w="10" w:type="dxa"/>
+              <w:right w:w="10" w:type="dxa"/>
+            </w:tcMar>
+          </w:tcPr>
+          <w:p>
+            <w:pPr>
+              <w:jc w:val="center"/>
+            </w:pPr>
+            <w:r>
+              <w:t>{% if page.img2 %}{{ page.img2 }}{% endif %}</w:t>
+            </w:r>
+          </w:p>
+        </w:tc>
+        <w:tc>
+          <w:tcPr>
+            <w:tcW w:type="dxa" w:w="3398"/>
+            <w:tcMar>
+              <w:top w:w="10" w:type="dxa"/>
+              <w:bottom w:w="15" w:type="dxa"/>
+              <w:left w:w="10" w:type="dxa"/>
+              <w:right w:w="10" w:type="dxa"/>
+            </w:tcMar>
+          </w:tcPr>
+          <w:p>
+            <w:pPr>
+              <w:jc w:val="center"/>
+            </w:pPr>
+            <w:r>
+              <w:t>{% if page.img3 %}{{ page.img3 }}{% endif %}</w:t>
+            </w:r>
+          </w:p>
+        </w:tc>
+      </w:tr>
+      <w:tr>
+        <w:tc>
+          <w:tcPr>
+            <w:tcW w:type="dxa" w:w="3398"/>
+            <w:tcMar>
+              <w:top w:w="10" w:type="dxa"/>
+              <w:bottom w:w="15" w:type="dxa"/>
+              <w:left w:w="10" w:type="dxa"/>
+              <w:right w:w="10" w:type="dxa"/>
+            </w:tcMar>
+          </w:tcPr>
+          <w:p>
+            <w:pPr>
+              <w:jc w:val="center"/>
+            </w:pPr>
+            <w:r>
+              <w:t>{% if page.img4 %}{{ page.img4 }}{% endif %}</w:t>
+            </w:r>
+          </w:p>
+        </w:tc>
+        <w:tc>
+          <w:tcPr>
+            <w:tcW w:type="dxa" w:w="3398"/>
+            <w:tcMar>
+              <w:top w:w="10" w:type="dxa"/>
+              <w:bottom w:w="15" w:type="dxa"/>
+              <w:left w:w="10" w:type="dxa"/>
+              <w:right w:w="10" w:type="dxa"/>
+            </w:tcMar>
+          </w:tcPr>
+          <w:p>
+            <w:pPr>
+              <w:jc w:val="center"/>
+            </w:pPr>
+            <w:r>
+              <w:t>{% if page.img5 %}{{ page.img5 }}{% endif %}</w:t>
+            </w:r>
+          </w:p>
+        </w:tc>
+        <w:tc>
+          <w:tcPr>
+            <w:tcW w:type="dxa" w:w="3398"/>
+            <w:tcMar>
+              <w:top w:w="10" w:type="dxa"/>
+              <w:bottom w:w="15" w:type="dxa"/>
+              <w:left w:w="10" w:type="dxa"/>
+              <w:right w:w="10" w:type="dxa"/>
+            </w:tcMar>
+          </w:tcPr>
+          <w:p>
+            <w:pPr>
+              <w:jc w:val="center"/>
+            </w:pPr>
+            <w:r>
+              <w:t>{% if page.img6 %}{{ page.img6 }}{% endif %}</w:t>
+            </w:r>
+          </w:p>
+        </w:tc>
+      </w:tr>
+    </w:tbl>
+    <w:p>
+      <w:r>
+        <w:t>{% endif %}</w:t>
+      </w:r>
+    </w:p>
+    <w:p>
+      <w:r>
+        <w:t>{% if page.layout == 'generic' %}</w:t>
+      </w:r>
+    </w:p>
+    <w:p>
+      <w:r>
+        <w:t>{% for row in page.generic_rows %}</w:t>
+      </w:r>
+    </w:p>
+    <w:tbl>
+      <w:tblPr>
+        <w:tblW w:type="auto" w:w="0"/>
+        <w:jc w:val="center"/>
+        <w:tblLayout w:type="fixed"/>
+        <w:tblLook w:firstColumn="1" w:firstRow="1" w:lastColumn="0" w:lastRow="0" w:noHBand="0" w:noVBand="1" w:val="04A0"/>
+        <w:tblBorders>
+          <w:top w:val="none"/>
+          <w:left w:val="none"/>
+          <w:bottom w:val="none"/>
+          <w:right w:val="none"/>
+          <w:insideH w:val="none"/>
+          <w:insideV w:val="none"/>
+        </w:tblBorders>
+      </w:tblPr>
+      <w:tblGrid>
+        <w:gridCol w:w="5234"/>
+        <w:gridCol w:w="5234"/>
+      </w:tblGrid>
+      <w:tr>
+        <w:tc>
+          <w:tcPr>
+            <w:tcW w:type="dxa" w:w="5112"/>
+            <w:tcMar>
+              <w:top w:w="10" w:type="dxa"/>
+              <w:bottom w:w="15" w:type="dxa"/>
+              <w:left w:w="15" w:type="dxa"/>
+              <w:right w:w="15" w:type="dxa"/>
+            </w:tcMar>
+          </w:tcPr>
+          <w:p>
+            <w:pPr>
+              <w:jc w:val="center"/>
+            </w:pPr>
+            <w:r>
+              <w:t>{% if row.img1 %}{{ row.img1 }}{% endif %}</w:t>
+            </w:r>
+          </w:p>
+        </w:tc>
+        <w:tc>
+          <w:tcPr>
+            <w:tcW w:type="dxa" w:w="5112"/>
+            <w:tcMar>
+              <w:top w:w="10" w:type="dxa"/>
+              <w:bottom w:w="15" w:type="dxa"/>
+              <w:left w:w="15" w:type="dxa"/>
+              <w:right w:w="15" w:type="dxa"/>
+            </w:tcMar>
+          </w:tcPr>
+          <w:p>
+            <w:pPr>
+              <w:jc w:val="center"/>
+            </w:pPr>
+            <w:r>
+              <w:t>{% if row.img2 %}{{ row.img2 }}{% endif %}</w:t>
+            </w:r>
+          </w:p>
+        </w:tc>
+      </w:tr>
+    </w:tbl>
+    <w:p>
+      <w:r>
         <w:t>{% endfor %}</w:t>
+      </w:r>
+    </w:p>
+    <w:p>
+      <w:r>
+        <w:t>{% endif %}</w:t>
       </w:r>
     </w:p>
     <w:p>
@@ -856,7 +1742,7 @@
         <w:sz w:val="19"/>
       </w:rPr>
       <w:tab/>
-      <w:t>Page</w:t>
+      <w:t xml:space="preserve">Page </w:t>
     </w:r>
     <w:r>
       <w:fldChar w:fldCharType="begin"/>
@@ -879,7 +1765,7 @@
         <w:color w:val="595959"/>
         <w:sz w:val="19"/>
       </w:rPr>
-      <w:t>of</w:t>
+      <w:t xml:space="preserve"> of </w:t>
     </w:r>
     <w:r>
       <w:fldChar w:fldCharType="begin"/>

</xml_diff>